<commit_message>
Melhoria na escrita dos problemas do sistema
</commit_message>
<xml_diff>
--- a/1.Requisitos/BRA - Visão.docx
+++ b/1.Requisitos/BRA - Visão.docx
@@ -2132,7 +2132,7 @@
       <w:tr>
         <w:tc>
           <w:tcPr>
-            <w:tcW w:w="3652" w:type="dxa"/>
+            <w:tcW w:w="3594" w:type="dxa"/>
             <w:shd w:val="pct5" w:color="auto" w:fill="auto"/>
           </w:tcPr>
           <w:p>
@@ -2155,7 +2155,7 @@
         </w:tc>
         <w:tc>
           <w:tcPr>
-            <w:tcW w:w="2123" w:type="dxa"/>
+            <w:tcW w:w="2102" w:type="dxa"/>
             <w:shd w:val="pct5" w:color="auto" w:fill="auto"/>
           </w:tcPr>
           <w:p>
@@ -2178,7 +2178,7 @@
         </w:tc>
         <w:tc>
           <w:tcPr>
-            <w:tcW w:w="3896" w:type="dxa"/>
+            <w:tcW w:w="3840" w:type="dxa"/>
             <w:shd w:val="pct5" w:color="auto" w:fill="auto"/>
           </w:tcPr>
           <w:p>
@@ -2201,7 +2201,7 @@
         </w:tc>
         <w:tc>
           <w:tcPr>
-            <w:tcW w:w="5683" w:type="dxa"/>
+            <w:tcW w:w="5592" w:type="dxa"/>
             <w:shd w:val="pct5" w:color="auto" w:fill="auto"/>
           </w:tcPr>
           <w:p>
@@ -2234,7 +2234,7 @@
       <w:tr>
         <w:tc>
           <w:tcPr>
-            <w:tcW w:w="3652" w:type="dxa"/>
+            <w:tcW w:w="3594" w:type="dxa"/>
           </w:tcPr>
           <w:p>
             <w:pPr>
@@ -2251,7 +2251,7 @@
                 <w:iCs/>
                 <w:color w:val="auto"/>
               </w:rPr>
-              <w:t>Não possuir uma maneira rápida e eficiente de</w:t>
+              <w:t xml:space="preserve">Não possuir uma maneira </w:t>
             </w:r>
             <w:r>
               <w:rPr>
@@ -2259,7 +2259,7 @@
                 <w:iCs/>
                 <w:color w:val="auto"/>
               </w:rPr>
-              <w:t xml:space="preserve"> </w:t>
+              <w:t>simples</w:t>
             </w:r>
             <w:r>
               <w:rPr>
@@ -2267,7 +2267,7 @@
                 <w:iCs/>
                 <w:color w:val="auto"/>
               </w:rPr>
-              <w:t>a</w:t>
+              <w:t xml:space="preserve"> de</w:t>
             </w:r>
             <w:r>
               <w:rPr>
@@ -2275,7 +2275,7 @@
                 <w:iCs/>
                 <w:color w:val="auto"/>
               </w:rPr>
-              <w:t>cess</w:t>
+              <w:t xml:space="preserve"> </w:t>
             </w:r>
             <w:r>
               <w:rPr>
@@ -2283,7 +2283,7 @@
                 <w:iCs/>
                 <w:color w:val="auto"/>
               </w:rPr>
-              <w:t>ar</w:t>
+              <w:t>a</w:t>
             </w:r>
             <w:r>
               <w:rPr>
@@ -2291,7 +2291,39 @@
                 <w:iCs/>
                 <w:color w:val="auto"/>
               </w:rPr>
-              <w:t xml:space="preserve"> estatísticas individuais dos atletas</w:t>
+              <w:t>cess</w:t>
+            </w:r>
+            <w:r>
+              <w:rPr>
+                <w:i w:val="0"/>
+                <w:iCs/>
+                <w:color w:val="auto"/>
+              </w:rPr>
+              <w:t>ar</w:t>
+            </w:r>
+            <w:r>
+              <w:rPr>
+                <w:i w:val="0"/>
+                <w:iCs/>
+                <w:color w:val="auto"/>
+              </w:rPr>
+              <w:t xml:space="preserve"> estatísticas individuais dos </w:t>
+            </w:r>
+            <w:r>
+              <w:rPr>
+                <w:i w:val="0"/>
+                <w:iCs/>
+                <w:color w:val="auto"/>
+              </w:rPr>
+              <w:t>jogadores</w:t>
+            </w:r>
+            <w:r>
+              <w:rPr>
+                <w:i w:val="0"/>
+                <w:iCs/>
+                <w:color w:val="auto"/>
+              </w:rPr>
+              <w:t xml:space="preserve"> que atuam no time do torcedor, incluindo estatísticas especificas por posição</w:t>
             </w:r>
             <w:r>
               <w:rPr>
@@ -2305,7 +2337,7 @@
         </w:tc>
         <w:tc>
           <w:tcPr>
-            <w:tcW w:w="2123" w:type="dxa"/>
+            <w:tcW w:w="2102" w:type="dxa"/>
           </w:tcPr>
           <w:p>
             <w:r>
@@ -2315,17 +2347,14 @@
         </w:tc>
         <w:tc>
           <w:tcPr>
-            <w:tcW w:w="3896" w:type="dxa"/>
+            <w:tcW w:w="3840" w:type="dxa"/>
           </w:tcPr>
           <w:p>
-            <w:r>
-              <w:t xml:space="preserve">1. </w:t>
-            </w:r>
-            <w:r>
-              <w:t>Dificuldade em identificar os melhores jogadores do clube</w:t>
-            </w:r>
-            <w:r>
-              <w:t>.</w:t>
+            <w:pPr>
+              <w:jc w:val="left"/>
+            </w:pPr>
+            <w:r>
+              <w:t>1. Dificuldade para identificar as estatísticas essenciais de cada posição dos jogadores atuando pelo clube.</w:t>
             </w:r>
           </w:p>
           <w:p>
@@ -2334,20 +2363,17 @@
             </w:pPr>
           </w:p>
           <w:p>
-            <w:r>
-              <w:t xml:space="preserve">2. </w:t>
-            </w:r>
-            <w:r>
-              <w:t>Dificuldade em identificar se um atleta cumpre as funções de sua posição de maneira eficiente</w:t>
-            </w:r>
-            <w:r>
-              <w:t>.</w:t>
+            <w:pPr>
+              <w:jc w:val="left"/>
+            </w:pPr>
+            <w:r>
+              <w:t>2. Gasto de tempo buscando por estatísticas específicas por posição que estão separadas das demais.</w:t>
             </w:r>
           </w:p>
         </w:tc>
         <w:tc>
           <w:tcPr>
-            <w:tcW w:w="5683" w:type="dxa"/>
+            <w:tcW w:w="5592" w:type="dxa"/>
           </w:tcPr>
           <w:p>
             <w:pPr>
@@ -2381,13 +2407,7 @@
                 <w:bCs/>
                 <w:lang w:val="pt-PT"/>
               </w:rPr>
-              <w:t>vizualizar as estatísticas individuais dos atletas do clube</w:t>
-            </w:r>
-            <w:r>
-              <w:rPr>
-                <w:lang w:val="pt-PT"/>
-              </w:rPr>
-              <w:t xml:space="preserve"> para saber </w:t>
+              <w:t>vizualizar as estatísticas individuais</w:t>
             </w:r>
             <w:r>
               <w:rPr>
@@ -2395,13 +2415,7 @@
                 <w:bCs/>
                 <w:lang w:val="pt-PT"/>
               </w:rPr>
-              <w:t>como estão desempenhando em campo</w:t>
-            </w:r>
-            <w:r>
-              <w:rPr>
-                <w:lang w:val="pt-PT"/>
-              </w:rPr>
-              <w:t xml:space="preserve">, além disso, eu </w:t>
+              <w:t xml:space="preserve"> específicas para as posições</w:t>
             </w:r>
             <w:r>
               <w:rPr>
@@ -2409,7 +2423,7 @@
                 <w:bCs/>
                 <w:lang w:val="pt-PT"/>
               </w:rPr>
-              <w:t xml:space="preserve">gostaria de dar </w:t>
+              <w:t xml:space="preserve"> </w:t>
             </w:r>
             <w:r>
               <w:rPr>
@@ -2417,7 +2431,7 @@
                 <w:bCs/>
                 <w:lang w:val="pt-PT"/>
               </w:rPr>
-              <w:t>prioridade</w:t>
+              <w:t xml:space="preserve">de todos </w:t>
             </w:r>
             <w:r>
               <w:rPr>
@@ -2425,7 +2439,7 @@
                 <w:bCs/>
                 <w:lang w:val="pt-PT"/>
               </w:rPr>
-              <w:t xml:space="preserve"> aos </w:t>
+              <w:t xml:space="preserve">os </w:t>
             </w:r>
             <w:r>
               <w:rPr>
@@ -2433,19 +2447,7 @@
                 <w:bCs/>
                 <w:lang w:val="pt-PT"/>
               </w:rPr>
-              <w:t>atletas que considero destaques do elenco</w:t>
-            </w:r>
-            <w:r>
-              <w:rPr>
-                <w:lang w:val="pt-PT"/>
-              </w:rPr>
-              <w:t xml:space="preserve"> para </w:t>
-            </w:r>
-            <w:r>
-              <w:rPr>
-                <w:lang w:val="pt-PT"/>
-              </w:rPr>
-              <w:t xml:space="preserve">que a </w:t>
+              <w:t>jogadores</w:t>
             </w:r>
             <w:r>
               <w:rPr>
@@ -2453,7 +2455,37 @@
                 <w:bCs/>
                 <w:lang w:val="pt-PT"/>
               </w:rPr>
-              <w:t>visualização dos mesmos seja mais fácil em relação aos demais atletas do clube</w:t>
+              <w:t xml:space="preserve"> do</w:t>
+            </w:r>
+            <w:r>
+              <w:rPr>
+                <w:b/>
+                <w:bCs/>
+                <w:lang w:val="pt-PT"/>
+              </w:rPr>
+              <w:t xml:space="preserve"> meu</w:t>
+            </w:r>
+            <w:r>
+              <w:rPr>
+                <w:b/>
+                <w:bCs/>
+                <w:lang w:val="pt-PT"/>
+              </w:rPr>
+              <w:t xml:space="preserve"> clube</w:t>
+            </w:r>
+            <w:r>
+              <w:rPr>
+                <w:lang w:val="pt-PT"/>
+              </w:rPr>
+              <w:t xml:space="preserve"> para saber </w:t>
+            </w:r>
+            <w:r>
+              <w:rPr>
+                <w:b/>
+                <w:bCs/>
+                <w:lang w:val="pt-PT"/>
+              </w:rPr>
+              <w:t>como estão desempenhando em campo</w:t>
             </w:r>
             <w:r>
               <w:rPr>
@@ -2462,57 +2494,312 @@
               <w:t>.</w:t>
             </w:r>
           </w:p>
-          <w:p/>
         </w:tc>
       </w:tr>
       <w:tr>
         <w:tc>
           <w:tcPr>
-            <w:tcW w:w="3652" w:type="dxa"/>
+            <w:tcW w:w="3594" w:type="dxa"/>
           </w:tcPr>
           <w:p>
-            <w:r>
-              <w:t>Dificuldade em prever</w:t>
-            </w:r>
-            <w:r>
-              <w:t xml:space="preserve"> chances de vitória em </w:t>
-            </w:r>
-            <w:r>
-              <w:t>um</w:t>
-            </w:r>
-            <w:r>
-              <w:t xml:space="preserve"> futuro embate</w:t>
-            </w:r>
-            <w:r>
+            <w:pPr>
+              <w:pStyle w:val="Instruo"/>
+              <w:jc w:val="both"/>
+              <w:rPr>
+                <w:i w:val="0"/>
+                <w:iCs/>
+                <w:color w:val="auto"/>
+              </w:rPr>
+            </w:pPr>
+            <w:r>
+              <w:rPr>
+                <w:i w:val="0"/>
+                <w:iCs/>
+                <w:color w:val="auto"/>
+              </w:rPr>
+              <w:t>Dificuldade em identificar os melhores jogadores de cada posição</w:t>
+            </w:r>
+            <w:r>
+              <w:rPr>
+                <w:i w:val="0"/>
+                <w:iCs/>
+                <w:color w:val="auto"/>
+              </w:rPr>
               <w:t>.</w:t>
             </w:r>
           </w:p>
         </w:tc>
         <w:tc>
           <w:tcPr>
-            <w:tcW w:w="2123" w:type="dxa"/>
+            <w:tcW w:w="2102" w:type="dxa"/>
+          </w:tcPr>
+          <w:p>
+            <w:r>
+              <w:t>Torcedores</w:t>
+            </w:r>
+          </w:p>
+        </w:tc>
+        <w:tc>
+          <w:tcPr>
+            <w:tcW w:w="3840" w:type="dxa"/>
+          </w:tcPr>
+          <w:p>
+            <w:r>
+              <w:t xml:space="preserve">1. Dificuldade em identificar os melhores jogadores </w:t>
+            </w:r>
+            <w:r>
+              <w:t>atuando pelo clube no momento</w:t>
+            </w:r>
+            <w:r>
+              <w:t>.</w:t>
+            </w:r>
+          </w:p>
+        </w:tc>
+        <w:tc>
+          <w:tcPr>
+            <w:tcW w:w="5592" w:type="dxa"/>
+          </w:tcPr>
+          <w:p>
+            <w:pPr>
+              <w:rPr>
+                <w:lang w:val="pt-PT"/>
+              </w:rPr>
+            </w:pPr>
+            <w:r>
+              <w:rPr>
+                <w:lang w:val="pt-PT"/>
+              </w:rPr>
+              <w:t xml:space="preserve">Como </w:t>
+            </w:r>
+            <w:r>
+              <w:rPr>
+                <w:b/>
+                <w:bCs/>
+                <w:lang w:val="pt-PT"/>
+              </w:rPr>
+              <w:t>torcedor</w:t>
+            </w:r>
+            <w:r>
+              <w:rPr>
+                <w:lang w:val="pt-PT"/>
+              </w:rPr>
+              <w:t xml:space="preserve"> eu quero </w:t>
+            </w:r>
+            <w:r>
+              <w:rPr>
+                <w:b/>
+                <w:bCs/>
+                <w:lang w:val="pt-PT"/>
+              </w:rPr>
+              <w:t>vizualizar quais são os melhores jogadores</w:t>
+            </w:r>
+            <w:r>
+              <w:rPr>
+                <w:lang w:val="pt-PT"/>
+              </w:rPr>
+              <w:t xml:space="preserve"> </w:t>
+            </w:r>
+            <w:r>
+              <w:rPr>
+                <w:b/>
+                <w:bCs/>
+                <w:lang w:val="pt-PT"/>
+              </w:rPr>
+              <w:t>de cada posição</w:t>
+            </w:r>
+            <w:r>
+              <w:rPr>
+                <w:lang w:val="pt-PT"/>
+              </w:rPr>
+              <w:t xml:space="preserve"> para </w:t>
+            </w:r>
+            <w:r>
+              <w:rPr>
+                <w:b/>
+                <w:bCs/>
+                <w:lang w:val="pt-PT"/>
+              </w:rPr>
+              <w:t>saber quais são as melhores peças a diposição do</w:t>
+            </w:r>
+            <w:r>
+              <w:rPr>
+                <w:b/>
+                <w:bCs/>
+                <w:lang w:val="pt-PT"/>
+              </w:rPr>
+              <w:t xml:space="preserve"> meu</w:t>
+            </w:r>
+            <w:r>
+              <w:rPr>
+                <w:b/>
+                <w:bCs/>
+                <w:lang w:val="pt-PT"/>
+              </w:rPr>
+              <w:t xml:space="preserve"> time</w:t>
+            </w:r>
+            <w:r>
+              <w:rPr>
+                <w:lang w:val="pt-PT"/>
+              </w:rPr>
+              <w:t>.</w:t>
+            </w:r>
+          </w:p>
+        </w:tc>
+      </w:tr>
+      <w:tr>
+        <w:tc>
+          <w:tcPr>
+            <w:tcW w:w="3594" w:type="dxa"/>
           </w:tcPr>
           <w:p>
             <w:pPr>
               <w:pStyle w:val="Instruo"/>
-              <w:rPr>
-                <w:i w:val="0"/>
-                <w:iCs/>
-              </w:rPr>
-            </w:pPr>
-            <w:r>
+              <w:jc w:val="both"/>
               <w:rPr>
                 <w:i w:val="0"/>
                 <w:iCs/>
                 <w:color w:val="auto"/>
               </w:rPr>
-              <w:t>Torcedores</w:t>
+            </w:pPr>
+            <w:r>
+              <w:rPr>
+                <w:i w:val="0"/>
+                <w:iCs/>
+                <w:color w:val="auto"/>
+              </w:rPr>
+              <w:t>Não poder favoritar um atleta</w:t>
             </w:r>
           </w:p>
         </w:tc>
         <w:tc>
           <w:tcPr>
-            <w:tcW w:w="3896" w:type="dxa"/>
+            <w:tcW w:w="2102" w:type="dxa"/>
+          </w:tcPr>
+          <w:p>
+            <w:r>
+              <w:t>Torcedores</w:t>
+            </w:r>
+          </w:p>
+        </w:tc>
+        <w:tc>
+          <w:tcPr>
+            <w:tcW w:w="3840" w:type="dxa"/>
+          </w:tcPr>
+          <w:p>
+            <w:r>
+              <w:t>1. Gasto de tempo procurando pelas estatísticas dos jogadores favoritos em meio a todos os outros que atuam pelo clube.</w:t>
+            </w:r>
+          </w:p>
+        </w:tc>
+        <w:tc>
+          <w:tcPr>
+            <w:tcW w:w="5592" w:type="dxa"/>
+          </w:tcPr>
+          <w:p>
+            <w:pPr>
+              <w:rPr>
+                <w:lang w:val="pt-PT"/>
+              </w:rPr>
+            </w:pPr>
+            <w:r>
+              <w:rPr>
+                <w:lang w:val="pt-PT"/>
+              </w:rPr>
+              <w:t xml:space="preserve">Como </w:t>
+            </w:r>
+            <w:r>
+              <w:rPr>
+                <w:b/>
+                <w:bCs/>
+                <w:lang w:val="pt-PT"/>
+              </w:rPr>
+              <w:t>torcedor</w:t>
+            </w:r>
+            <w:r>
+              <w:rPr>
+                <w:lang w:val="pt-PT"/>
+              </w:rPr>
+              <w:t xml:space="preserve"> eu quero </w:t>
+            </w:r>
+            <w:r>
+              <w:rPr>
+                <w:b/>
+                <w:bCs/>
+                <w:lang w:val="pt-PT"/>
+              </w:rPr>
+              <w:t>favoritar jogadores</w:t>
+            </w:r>
+            <w:r>
+              <w:rPr>
+                <w:lang w:val="pt-PT"/>
+              </w:rPr>
+              <w:t xml:space="preserve"> para </w:t>
+            </w:r>
+            <w:r>
+              <w:rPr>
+                <w:b/>
+                <w:bCs/>
+                <w:lang w:val="pt-PT"/>
+              </w:rPr>
+              <w:t>destacá-los dos demais que atuam pelo clube na minha visualização</w:t>
+            </w:r>
+            <w:r>
+              <w:rPr>
+                <w:lang w:val="pt-PT"/>
+              </w:rPr>
+              <w:t>.</w:t>
+            </w:r>
+          </w:p>
+        </w:tc>
+      </w:tr>
+      <w:tr>
+        <w:tc>
+          <w:tcPr>
+            <w:tcW w:w="3594" w:type="dxa"/>
+          </w:tcPr>
+          <w:p>
+            <w:r>
+              <w:t>Dificuldade em prever</w:t>
+            </w:r>
+            <w:r>
+              <w:t xml:space="preserve"> chances de vitória em </w:t>
+            </w:r>
+            <w:r>
+              <w:t>um</w:t>
+            </w:r>
+            <w:r>
+              <w:t xml:space="preserve"> futuro embate</w:t>
+            </w:r>
+            <w:r>
+              <w:t>.</w:t>
+            </w:r>
+          </w:p>
+        </w:tc>
+        <w:tc>
+          <w:tcPr>
+            <w:tcW w:w="2102" w:type="dxa"/>
+          </w:tcPr>
+          <w:p>
+            <w:pPr>
+              <w:pStyle w:val="Instruo"/>
+              <w:rPr>
+                <w:i w:val="0"/>
+                <w:iCs/>
+              </w:rPr>
+            </w:pPr>
+            <w:r>
+              <w:rPr>
+                <w:i w:val="0"/>
+                <w:iCs/>
+                <w:color w:val="auto"/>
+              </w:rPr>
+              <w:t>Torcedores</w:t>
+            </w:r>
+          </w:p>
+        </w:tc>
+        <w:tc>
+          <w:tcPr>
+            <w:tcW w:w="3840" w:type="dxa"/>
           </w:tcPr>
           <w:p>
             <w:pPr>
@@ -2555,7 +2842,7 @@
         </w:tc>
         <w:tc>
           <w:tcPr>
-            <w:tcW w:w="5683" w:type="dxa"/>
+            <w:tcW w:w="5592" w:type="dxa"/>
           </w:tcPr>
           <w:p>
             <w:pPr>
@@ -2952,13 +3239,13 @@
               <w:rPr>
                 <w:lang w:val="pt-PT"/>
               </w:rPr>
-              <w:t xml:space="preserve"> atletas </w:t>
-            </w:r>
-            <w:r>
-              <w:rPr>
-                <w:lang w:val="pt-PT"/>
-              </w:rPr>
-              <w:t>selecionando os que considerar destaques do elenco.</w:t>
+              <w:t xml:space="preserve"> atletas</w:t>
+            </w:r>
+            <w:r>
+              <w:rPr>
+                <w:lang w:val="pt-PT"/>
+              </w:rPr>
+              <w:t>.</w:t>
             </w:r>
           </w:p>
           <w:p>
@@ -2978,7 +3265,33 @@
               <w:rPr>
                 <w:lang w:val="pt-PT"/>
               </w:rPr>
-              <w:t xml:space="preserve">3. Selecionar </w:t>
+              <w:t>3. Favoritar jogadores.</w:t>
+            </w:r>
+          </w:p>
+          <w:p>
+            <w:pPr>
+              <w:rPr>
+                <w:lang w:val="pt-PT"/>
+              </w:rPr>
+            </w:pPr>
+          </w:p>
+          <w:p>
+            <w:pPr>
+              <w:rPr>
+                <w:lang w:val="pt-PT"/>
+              </w:rPr>
+            </w:pPr>
+            <w:r>
+              <w:rPr>
+                <w:lang w:val="pt-PT"/>
+              </w:rPr>
+              <w:t>4</w:t>
+            </w:r>
+            <w:r>
+              <w:rPr>
+                <w:lang w:val="pt-PT"/>
+              </w:rPr>
+              <w:t xml:space="preserve">. Selecionar </w:t>
             </w:r>
             <w:r>
               <w:rPr>
@@ -4110,10 +4423,10 @@
                 <v:path o:extrusionok="f" gradientshapeok="t" o:connecttype="rect"/>
                 <o:lock v:ext="edit" aspectratio="t"/>
               </v:shapetype>
-              <v:shape id="_x0000_i1025" type="#_x0000_t75" style="width:61.8pt;height:34.8pt">
+              <v:shape id="_x0000_i1025" type="#_x0000_t75" style="width:62pt;height:35pt">
                 <v:imagedata r:id="rId1" o:title=""/>
               </v:shape>
-              <o:OLEObject Type="Embed" ProgID="Word.Picture.8" ShapeID="_x0000_i1025" DrawAspect="Content" ObjectID="_1849172771" r:id="rId2"/>
+              <o:OLEObject Type="Embed" ProgID="Word.Picture.8" ShapeID="_x0000_i1025" DrawAspect="Content" ObjectID="_1849765840" r:id="rId2"/>
             </w:object>
           </w:r>
         </w:p>
@@ -4247,10 +4560,10 @@
                 <v:path o:extrusionok="f" gradientshapeok="t" o:connecttype="rect"/>
                 <o:lock v:ext="edit" aspectratio="t"/>
               </v:shapetype>
-              <v:shape id="_x0000_i1026" type="#_x0000_t75" style="width:61.8pt;height:34.8pt">
+              <v:shape id="_x0000_i1026" type="#_x0000_t75" style="width:62pt;height:35pt">
                 <v:imagedata r:id="rId1" o:title=""/>
               </v:shape>
-              <o:OLEObject Type="Embed" ProgID="Word.Picture.8" ShapeID="_x0000_i1026" DrawAspect="Content" ObjectID="_1849172772" r:id="rId2"/>
+              <o:OLEObject Type="Embed" ProgID="Word.Picture.8" ShapeID="_x0000_i1026" DrawAspect="Content" ObjectID="_1849765841" r:id="rId2"/>
             </w:object>
           </w:r>
         </w:p>
@@ -4384,10 +4697,10 @@
                 <v:path o:extrusionok="f" gradientshapeok="t" o:connecttype="rect"/>
                 <o:lock v:ext="edit" aspectratio="t"/>
               </v:shapetype>
-              <v:shape id="_x0000_i1027" type="#_x0000_t75" style="width:61.8pt;height:34.8pt">
+              <v:shape id="_x0000_i1027" type="#_x0000_t75" style="width:62pt;height:35pt">
                 <v:imagedata r:id="rId1" o:title=""/>
               </v:shape>
-              <o:OLEObject Type="Embed" ProgID="Word.Picture.8" ShapeID="_x0000_i1027" DrawAspect="Content" ObjectID="_1849172773" r:id="rId2"/>
+              <o:OLEObject Type="Embed" ProgID="Word.Picture.8" ShapeID="_x0000_i1027" DrawAspect="Content" ObjectID="_1849765842" r:id="rId2"/>
             </w:object>
           </w:r>
         </w:p>
@@ -5404,6 +5717,184 @@
     </w:lvl>
   </w:abstractNum>
   <w:abstractNum w:abstractNumId="9" w15:restartNumberingAfterBreak="0">
+    <w:nsid w:val="598E66BE"/>
+    <w:multiLevelType w:val="hybridMultilevel"/>
+    <w:tmpl w:val="D62C10AA"/>
+    <w:lvl w:ilvl="0" w:tplc="0416000F">
+      <w:start w:val="1"/>
+      <w:numFmt w:val="decimal"/>
+      <w:lvlText w:val="%1."/>
+      <w:lvlJc w:val="left"/>
+      <w:pPr>
+        <w:ind w:left="720" w:hanging="360"/>
+      </w:pPr>
+      <w:rPr>
+        <w:rFonts w:hint="default"/>
+      </w:rPr>
+    </w:lvl>
+    <w:lvl w:ilvl="1" w:tplc="04160019" w:tentative="1">
+      <w:start w:val="1"/>
+      <w:numFmt w:val="lowerLetter"/>
+      <w:lvlText w:val="%2."/>
+      <w:lvlJc w:val="left"/>
+      <w:pPr>
+        <w:ind w:left="1440" w:hanging="360"/>
+      </w:pPr>
+    </w:lvl>
+    <w:lvl w:ilvl="2" w:tplc="0416001B" w:tentative="1">
+      <w:start w:val="1"/>
+      <w:numFmt w:val="lowerRoman"/>
+      <w:lvlText w:val="%3."/>
+      <w:lvlJc w:val="right"/>
+      <w:pPr>
+        <w:ind w:left="2160" w:hanging="180"/>
+      </w:pPr>
+    </w:lvl>
+    <w:lvl w:ilvl="3" w:tplc="0416000F" w:tentative="1">
+      <w:start w:val="1"/>
+      <w:numFmt w:val="decimal"/>
+      <w:lvlText w:val="%4."/>
+      <w:lvlJc w:val="left"/>
+      <w:pPr>
+        <w:ind w:left="2880" w:hanging="360"/>
+      </w:pPr>
+    </w:lvl>
+    <w:lvl w:ilvl="4" w:tplc="04160019" w:tentative="1">
+      <w:start w:val="1"/>
+      <w:numFmt w:val="lowerLetter"/>
+      <w:lvlText w:val="%5."/>
+      <w:lvlJc w:val="left"/>
+      <w:pPr>
+        <w:ind w:left="3600" w:hanging="360"/>
+      </w:pPr>
+    </w:lvl>
+    <w:lvl w:ilvl="5" w:tplc="0416001B" w:tentative="1">
+      <w:start w:val="1"/>
+      <w:numFmt w:val="lowerRoman"/>
+      <w:lvlText w:val="%6."/>
+      <w:lvlJc w:val="right"/>
+      <w:pPr>
+        <w:ind w:left="4320" w:hanging="180"/>
+      </w:pPr>
+    </w:lvl>
+    <w:lvl w:ilvl="6" w:tplc="0416000F" w:tentative="1">
+      <w:start w:val="1"/>
+      <w:numFmt w:val="decimal"/>
+      <w:lvlText w:val="%7."/>
+      <w:lvlJc w:val="left"/>
+      <w:pPr>
+        <w:ind w:left="5040" w:hanging="360"/>
+      </w:pPr>
+    </w:lvl>
+    <w:lvl w:ilvl="7" w:tplc="04160019" w:tentative="1">
+      <w:start w:val="1"/>
+      <w:numFmt w:val="lowerLetter"/>
+      <w:lvlText w:val="%8."/>
+      <w:lvlJc w:val="left"/>
+      <w:pPr>
+        <w:ind w:left="5760" w:hanging="360"/>
+      </w:pPr>
+    </w:lvl>
+    <w:lvl w:ilvl="8" w:tplc="0416001B" w:tentative="1">
+      <w:start w:val="1"/>
+      <w:numFmt w:val="lowerRoman"/>
+      <w:lvlText w:val="%9."/>
+      <w:lvlJc w:val="right"/>
+      <w:pPr>
+        <w:ind w:left="6480" w:hanging="180"/>
+      </w:pPr>
+    </w:lvl>
+  </w:abstractNum>
+  <w:abstractNum w:abstractNumId="10" w15:restartNumberingAfterBreak="0">
+    <w:nsid w:val="702D452E"/>
+    <w:multiLevelType w:val="hybridMultilevel"/>
+    <w:tmpl w:val="A7D05B70"/>
+    <w:lvl w:ilvl="0" w:tplc="0416000F">
+      <w:start w:val="1"/>
+      <w:numFmt w:val="decimal"/>
+      <w:lvlText w:val="%1."/>
+      <w:lvlJc w:val="left"/>
+      <w:pPr>
+        <w:ind w:left="720" w:hanging="360"/>
+      </w:pPr>
+      <w:rPr>
+        <w:rFonts w:hint="default"/>
+      </w:rPr>
+    </w:lvl>
+    <w:lvl w:ilvl="1" w:tplc="04160019" w:tentative="1">
+      <w:start w:val="1"/>
+      <w:numFmt w:val="lowerLetter"/>
+      <w:lvlText w:val="%2."/>
+      <w:lvlJc w:val="left"/>
+      <w:pPr>
+        <w:ind w:left="1440" w:hanging="360"/>
+      </w:pPr>
+    </w:lvl>
+    <w:lvl w:ilvl="2" w:tplc="0416001B" w:tentative="1">
+      <w:start w:val="1"/>
+      <w:numFmt w:val="lowerRoman"/>
+      <w:lvlText w:val="%3."/>
+      <w:lvlJc w:val="right"/>
+      <w:pPr>
+        <w:ind w:left="2160" w:hanging="180"/>
+      </w:pPr>
+    </w:lvl>
+    <w:lvl w:ilvl="3" w:tplc="0416000F" w:tentative="1">
+      <w:start w:val="1"/>
+      <w:numFmt w:val="decimal"/>
+      <w:lvlText w:val="%4."/>
+      <w:lvlJc w:val="left"/>
+      <w:pPr>
+        <w:ind w:left="2880" w:hanging="360"/>
+      </w:pPr>
+    </w:lvl>
+    <w:lvl w:ilvl="4" w:tplc="04160019" w:tentative="1">
+      <w:start w:val="1"/>
+      <w:numFmt w:val="lowerLetter"/>
+      <w:lvlText w:val="%5."/>
+      <w:lvlJc w:val="left"/>
+      <w:pPr>
+        <w:ind w:left="3600" w:hanging="360"/>
+      </w:pPr>
+    </w:lvl>
+    <w:lvl w:ilvl="5" w:tplc="0416001B" w:tentative="1">
+      <w:start w:val="1"/>
+      <w:numFmt w:val="lowerRoman"/>
+      <w:lvlText w:val="%6."/>
+      <w:lvlJc w:val="right"/>
+      <w:pPr>
+        <w:ind w:left="4320" w:hanging="180"/>
+      </w:pPr>
+    </w:lvl>
+    <w:lvl w:ilvl="6" w:tplc="0416000F" w:tentative="1">
+      <w:start w:val="1"/>
+      <w:numFmt w:val="decimal"/>
+      <w:lvlText w:val="%7."/>
+      <w:lvlJc w:val="left"/>
+      <w:pPr>
+        <w:ind w:left="5040" w:hanging="360"/>
+      </w:pPr>
+    </w:lvl>
+    <w:lvl w:ilvl="7" w:tplc="04160019" w:tentative="1">
+      <w:start w:val="1"/>
+      <w:numFmt w:val="lowerLetter"/>
+      <w:lvlText w:val="%8."/>
+      <w:lvlJc w:val="left"/>
+      <w:pPr>
+        <w:ind w:left="5760" w:hanging="360"/>
+      </w:pPr>
+    </w:lvl>
+    <w:lvl w:ilvl="8" w:tplc="0416001B" w:tentative="1">
+      <w:start w:val="1"/>
+      <w:numFmt w:val="lowerRoman"/>
+      <w:lvlText w:val="%9."/>
+      <w:lvlJc w:val="right"/>
+      <w:pPr>
+        <w:ind w:left="6480" w:hanging="180"/>
+      </w:pPr>
+    </w:lvl>
+  </w:abstractNum>
+  <w:abstractNum w:abstractNumId="11" w15:restartNumberingAfterBreak="0">
     <w:nsid w:val="72D2393C"/>
     <w:multiLevelType w:val="hybridMultilevel"/>
     <w:tmpl w:val="E710EEFE"/>
@@ -5489,7 +5980,7 @@
       </w:pPr>
     </w:lvl>
   </w:abstractNum>
-  <w:abstractNum w:abstractNumId="10" w15:restartNumberingAfterBreak="0">
+  <w:abstractNum w:abstractNumId="12" w15:restartNumberingAfterBreak="0">
     <w:nsid w:val="73F37BFE"/>
     <w:multiLevelType w:val="hybridMultilevel"/>
     <w:tmpl w:val="FA704D92"/>
@@ -5630,7 +6121,7 @@
       </w:rPr>
     </w:lvl>
   </w:abstractNum>
-  <w:abstractNum w:abstractNumId="11" w15:restartNumberingAfterBreak="0">
+  <w:abstractNum w:abstractNumId="13" w15:restartNumberingAfterBreak="0">
     <w:nsid w:val="75CD01DE"/>
     <w:multiLevelType w:val="hybridMultilevel"/>
     <w:tmpl w:val="9B5ECE46"/>
@@ -5716,7 +6207,7 @@
       </w:pPr>
     </w:lvl>
   </w:abstractNum>
-  <w:abstractNum w:abstractNumId="12" w15:restartNumberingAfterBreak="0">
+  <w:abstractNum w:abstractNumId="14" w15:restartNumberingAfterBreak="0">
     <w:nsid w:val="775133A1"/>
     <w:multiLevelType w:val="multilevel"/>
     <w:tmpl w:val="65BC53E8"/>
@@ -5853,19 +6344,19 @@
     </w:lvl>
   </w:abstractNum>
   <w:num w:numId="1" w16cid:durableId="1261329554">
-    <w:abstractNumId w:val="10"/>
+    <w:abstractNumId w:val="12"/>
   </w:num>
   <w:num w:numId="2" w16cid:durableId="1488327854">
-    <w:abstractNumId w:val="12"/>
+    <w:abstractNumId w:val="14"/>
   </w:num>
   <w:num w:numId="3" w16cid:durableId="823275947">
-    <w:abstractNumId w:val="12"/>
+    <w:abstractNumId w:val="14"/>
   </w:num>
   <w:num w:numId="4" w16cid:durableId="901720957">
-    <w:abstractNumId w:val="12"/>
+    <w:abstractNumId w:val="14"/>
   </w:num>
   <w:num w:numId="5" w16cid:durableId="2016181686">
-    <w:abstractNumId w:val="12"/>
+    <w:abstractNumId w:val="14"/>
   </w:num>
   <w:num w:numId="6" w16cid:durableId="19430685">
     <w:abstractNumId w:val="5"/>
@@ -5877,10 +6368,10 @@
     <w:abstractNumId w:val="7"/>
   </w:num>
   <w:num w:numId="9" w16cid:durableId="776825411">
-    <w:abstractNumId w:val="11"/>
+    <w:abstractNumId w:val="13"/>
   </w:num>
   <w:num w:numId="10" w16cid:durableId="104278955">
-    <w:abstractNumId w:val="9"/>
+    <w:abstractNumId w:val="11"/>
   </w:num>
   <w:num w:numId="11" w16cid:durableId="1851488227">
     <w:abstractNumId w:val="1"/>
@@ -5899,6 +6390,12 @@
   </w:num>
   <w:num w:numId="16" w16cid:durableId="1105534364">
     <w:abstractNumId w:val="2"/>
+  </w:num>
+  <w:num w:numId="17" w16cid:durableId="752628878">
+    <w:abstractNumId w:val="9"/>
+  </w:num>
+  <w:num w:numId="18" w16cid:durableId="109013871">
+    <w:abstractNumId w:val="10"/>
   </w:num>
   <w:numIdMacAtCleanup w:val="6"/>
 </w:numbering>
@@ -7031,10 +7528,12 @@
     <w:rsid w:val="005F2ABF"/>
     <w:rsid w:val="00637FB3"/>
     <w:rsid w:val="006D2741"/>
+    <w:rsid w:val="00781519"/>
     <w:rsid w:val="007E18C9"/>
     <w:rsid w:val="00817CBD"/>
     <w:rsid w:val="00A065C3"/>
     <w:rsid w:val="00A938B6"/>
+    <w:rsid w:val="00BC6693"/>
     <w:rsid w:val="00C41526"/>
     <w:rsid w:val="00C42F55"/>
     <w:rsid w:val="00C56FD9"/>

</xml_diff>